<commit_message>
Okuma Kitapçığım 4: tek sayfa dikey okuma, Ali-Ela-Nil cümleleri ve baklavaları
Karesel metin sayfası çıkarıldı (16 sayfa); PDF ve Word yenilendi.

Co-Authored-By: Claude Opus 5.5 <noreply@anthropic.com>
Claude-Session: https://claude.ai/code/session_013rJvdwwEBw6Dtdcu3nGFgV
</commit_message>
<xml_diff>
--- a/okuma-kitapcigi-4-a-n-e-t-i-l.docx
+++ b/okuma-kitapcigi-4-a-n-e-t-i-l.docx
@@ -18,7 +18,7 @@
               <a:graphicData uri="http://schemas.openxmlformats.org/drawingml/2006/picture">
                 <pic:pic>
                   <pic:nvPicPr>
-                    <pic:cNvPr id="0" name="image.jpg"/>
+                    <pic:cNvPr id="0" name="p-01.jpg"/>
                     <pic:cNvPicPr/>
                   </pic:nvPicPr>
                   <pic:blipFill>
@@ -43,7 +43,6 @@
     </w:p>
     <w:p>
       <w:pPr>
-        <w:pageBreakBefore/>
         <w:spacing w:before="0" w:after="0" w:line="240" w:lineRule="auto"/>
       </w:pPr>
       <w:r>
@@ -58,7 +57,7 @@
               <a:graphicData uri="http://schemas.openxmlformats.org/drawingml/2006/picture">
                 <pic:pic>
                   <pic:nvPicPr>
-                    <pic:cNvPr id="0" name="image.jpg"/>
+                    <pic:cNvPr id="0" name="p-02.jpg"/>
                     <pic:cNvPicPr/>
                   </pic:nvPicPr>
                   <pic:blipFill>
@@ -83,7 +82,6 @@
     </w:p>
     <w:p>
       <w:pPr>
-        <w:pageBreakBefore/>
         <w:spacing w:before="0" w:after="0" w:line="240" w:lineRule="auto"/>
       </w:pPr>
       <w:r>
@@ -98,7 +96,7 @@
               <a:graphicData uri="http://schemas.openxmlformats.org/drawingml/2006/picture">
                 <pic:pic>
                   <pic:nvPicPr>
-                    <pic:cNvPr id="0" name="image.jpg"/>
+                    <pic:cNvPr id="0" name="p-03.jpg"/>
                     <pic:cNvPicPr/>
                   </pic:nvPicPr>
                   <pic:blipFill>
@@ -123,7 +121,6 @@
     </w:p>
     <w:p>
       <w:pPr>
-        <w:pageBreakBefore/>
         <w:spacing w:before="0" w:after="0" w:line="240" w:lineRule="auto"/>
       </w:pPr>
       <w:r>
@@ -138,7 +135,7 @@
               <a:graphicData uri="http://schemas.openxmlformats.org/drawingml/2006/picture">
                 <pic:pic>
                   <pic:nvPicPr>
-                    <pic:cNvPr id="0" name="image.jpg"/>
+                    <pic:cNvPr id="0" name="p-04.jpg"/>
                     <pic:cNvPicPr/>
                   </pic:nvPicPr>
                   <pic:blipFill>
@@ -163,7 +160,6 @@
     </w:p>
     <w:p>
       <w:pPr>
-        <w:pageBreakBefore/>
         <w:spacing w:before="0" w:after="0" w:line="240" w:lineRule="auto"/>
       </w:pPr>
       <w:r>
@@ -178,7 +174,7 @@
               <a:graphicData uri="http://schemas.openxmlformats.org/drawingml/2006/picture">
                 <pic:pic>
                   <pic:nvPicPr>
-                    <pic:cNvPr id="0" name="image.jpg"/>
+                    <pic:cNvPr id="0" name="p-05.jpg"/>
                     <pic:cNvPicPr/>
                   </pic:nvPicPr>
                   <pic:blipFill>
@@ -203,7 +199,6 @@
     </w:p>
     <w:p>
       <w:pPr>
-        <w:pageBreakBefore/>
         <w:spacing w:before="0" w:after="0" w:line="240" w:lineRule="auto"/>
       </w:pPr>
       <w:r>
@@ -218,7 +213,7 @@
               <a:graphicData uri="http://schemas.openxmlformats.org/drawingml/2006/picture">
                 <pic:pic>
                   <pic:nvPicPr>
-                    <pic:cNvPr id="0" name="image.jpg"/>
+                    <pic:cNvPr id="0" name="p-06.jpg"/>
                     <pic:cNvPicPr/>
                   </pic:nvPicPr>
                   <pic:blipFill>
@@ -243,7 +238,6 @@
     </w:p>
     <w:p>
       <w:pPr>
-        <w:pageBreakBefore/>
         <w:spacing w:before="0" w:after="0" w:line="240" w:lineRule="auto"/>
       </w:pPr>
       <w:r>
@@ -258,7 +252,7 @@
               <a:graphicData uri="http://schemas.openxmlformats.org/drawingml/2006/picture">
                 <pic:pic>
                   <pic:nvPicPr>
-                    <pic:cNvPr id="0" name="image.jpg"/>
+                    <pic:cNvPr id="0" name="p-07.jpg"/>
                     <pic:cNvPicPr/>
                   </pic:nvPicPr>
                   <pic:blipFill>
@@ -283,7 +277,6 @@
     </w:p>
     <w:p>
       <w:pPr>
-        <w:pageBreakBefore/>
         <w:spacing w:before="0" w:after="0" w:line="240" w:lineRule="auto"/>
       </w:pPr>
       <w:r>
@@ -298,7 +291,7 @@
               <a:graphicData uri="http://schemas.openxmlformats.org/drawingml/2006/picture">
                 <pic:pic>
                   <pic:nvPicPr>
-                    <pic:cNvPr id="0" name="image.jpg"/>
+                    <pic:cNvPr id="0" name="p-08.jpg"/>
                     <pic:cNvPicPr/>
                   </pic:nvPicPr>
                   <pic:blipFill>
@@ -323,7 +316,6 @@
     </w:p>
     <w:p>
       <w:pPr>
-        <w:pageBreakBefore/>
         <w:spacing w:before="0" w:after="0" w:line="240" w:lineRule="auto"/>
       </w:pPr>
       <w:r>
@@ -338,7 +330,7 @@
               <a:graphicData uri="http://schemas.openxmlformats.org/drawingml/2006/picture">
                 <pic:pic>
                   <pic:nvPicPr>
-                    <pic:cNvPr id="0" name="image.jpg"/>
+                    <pic:cNvPr id="0" name="p-09.jpg"/>
                     <pic:cNvPicPr/>
                   </pic:nvPicPr>
                   <pic:blipFill>
@@ -363,7 +355,6 @@
     </w:p>
     <w:p>
       <w:pPr>
-        <w:pageBreakBefore/>
         <w:spacing w:before="0" w:after="0" w:line="240" w:lineRule="auto"/>
       </w:pPr>
       <w:r>
@@ -378,7 +369,7 @@
               <a:graphicData uri="http://schemas.openxmlformats.org/drawingml/2006/picture">
                 <pic:pic>
                   <pic:nvPicPr>
-                    <pic:cNvPr id="0" name="image.jpg"/>
+                    <pic:cNvPr id="0" name="p-10.jpg"/>
                     <pic:cNvPicPr/>
                   </pic:nvPicPr>
                   <pic:blipFill>
@@ -403,7 +394,6 @@
     </w:p>
     <w:p>
       <w:pPr>
-        <w:pageBreakBefore/>
         <w:spacing w:before="0" w:after="0" w:line="240" w:lineRule="auto"/>
       </w:pPr>
       <w:r>
@@ -418,7 +408,7 @@
               <a:graphicData uri="http://schemas.openxmlformats.org/drawingml/2006/picture">
                 <pic:pic>
                   <pic:nvPicPr>
-                    <pic:cNvPr id="0" name="image.jpg"/>
+                    <pic:cNvPr id="0" name="p-11.jpg"/>
                     <pic:cNvPicPr/>
                   </pic:nvPicPr>
                   <pic:blipFill>
@@ -443,7 +433,6 @@
     </w:p>
     <w:p>
       <w:pPr>
-        <w:pageBreakBefore/>
         <w:spacing w:before="0" w:after="0" w:line="240" w:lineRule="auto"/>
       </w:pPr>
       <w:r>
@@ -458,7 +447,7 @@
               <a:graphicData uri="http://schemas.openxmlformats.org/drawingml/2006/picture">
                 <pic:pic>
                   <pic:nvPicPr>
-                    <pic:cNvPr id="0" name="image.jpg"/>
+                    <pic:cNvPr id="0" name="p-12.jpg"/>
                     <pic:cNvPicPr/>
                   </pic:nvPicPr>
                   <pic:blipFill>
@@ -483,7 +472,6 @@
     </w:p>
     <w:p>
       <w:pPr>
-        <w:pageBreakBefore/>
         <w:spacing w:before="0" w:after="0" w:line="240" w:lineRule="auto"/>
       </w:pPr>
       <w:r>
@@ -498,7 +486,7 @@
               <a:graphicData uri="http://schemas.openxmlformats.org/drawingml/2006/picture">
                 <pic:pic>
                   <pic:nvPicPr>
-                    <pic:cNvPr id="0" name="image.jpg"/>
+                    <pic:cNvPr id="0" name="p-13.jpg"/>
                     <pic:cNvPicPr/>
                   </pic:nvPicPr>
                   <pic:blipFill>
@@ -523,7 +511,6 @@
     </w:p>
     <w:p>
       <w:pPr>
-        <w:pageBreakBefore/>
         <w:spacing w:before="0" w:after="0" w:line="240" w:lineRule="auto"/>
       </w:pPr>
       <w:r>
@@ -538,7 +525,7 @@
               <a:graphicData uri="http://schemas.openxmlformats.org/drawingml/2006/picture">
                 <pic:pic>
                   <pic:nvPicPr>
-                    <pic:cNvPr id="0" name="image.jpg"/>
+                    <pic:cNvPr id="0" name="p-14.jpg"/>
                     <pic:cNvPicPr/>
                   </pic:nvPicPr>
                   <pic:blipFill>
@@ -563,7 +550,6 @@
     </w:p>
     <w:p>
       <w:pPr>
-        <w:pageBreakBefore/>
         <w:spacing w:before="0" w:after="0" w:line="240" w:lineRule="auto"/>
       </w:pPr>
       <w:r>
@@ -578,7 +564,7 @@
               <a:graphicData uri="http://schemas.openxmlformats.org/drawingml/2006/picture">
                 <pic:pic>
                   <pic:nvPicPr>
-                    <pic:cNvPr id="0" name="image.jpg"/>
+                    <pic:cNvPr id="0" name="p-15.jpg"/>
                     <pic:cNvPicPr/>
                   </pic:nvPicPr>
                   <pic:blipFill>
@@ -603,7 +589,6 @@
     </w:p>
     <w:p>
       <w:pPr>
-        <w:pageBreakBefore/>
         <w:spacing w:before="0" w:after="0" w:line="240" w:lineRule="auto"/>
       </w:pPr>
       <w:r>
@@ -618,7 +603,7 @@
               <a:graphicData uri="http://schemas.openxmlformats.org/drawingml/2006/picture">
                 <pic:pic>
                   <pic:nvPicPr>
-                    <pic:cNvPr id="0" name="image.jpg"/>
+                    <pic:cNvPr id="0" name="p-16.jpg"/>
                     <pic:cNvPicPr/>
                   </pic:nvPicPr>
                   <pic:blipFill>
@@ -641,48 +626,8 @@
         </w:drawing>
       </w:r>
     </w:p>
-    <w:p>
-      <w:pPr>
-        <w:pageBreakBefore/>
-        <w:spacing w:before="0" w:after="0" w:line="240" w:lineRule="auto"/>
-      </w:pPr>
-      <w:r>
-        <w:drawing>
-          <wp:inline xmlns:a="http://schemas.openxmlformats.org/drawingml/2006/main" xmlns:pic="http://schemas.openxmlformats.org/drawingml/2006/picture">
-            <wp:extent cx="7524000" cy="10638000"/>
-            <wp:docPr id="17" name="Picture 17"/>
-            <wp:cNvGraphicFramePr>
-              <a:graphicFrameLocks noChangeAspect="1"/>
-            </wp:cNvGraphicFramePr>
-            <a:graphic>
-              <a:graphicData uri="http://schemas.openxmlformats.org/drawingml/2006/picture">
-                <pic:pic>
-                  <pic:nvPicPr>
-                    <pic:cNvPr id="0" name="image.jpg"/>
-                    <pic:cNvPicPr/>
-                  </pic:nvPicPr>
-                  <pic:blipFill>
-                    <a:blip r:embed="rId25"/>
-                    <a:stretch>
-                      <a:fillRect/>
-                    </a:stretch>
-                  </pic:blipFill>
-                  <pic:spPr>
-                    <a:xfrm>
-                      <a:off x="0" y="0"/>
-                      <a:ext cx="7524000" cy="10638000"/>
-                    </a:xfrm>
-                    <a:prstGeom prst="rect"/>
-                  </pic:spPr>
-                </pic:pic>
-              </a:graphicData>
-            </a:graphic>
-          </wp:inline>
-        </w:drawing>
-      </w:r>
-    </w:p>
     <w:sectPr>
-      <w:pgSz w:w="11906" w:h="16838"/>
+      <w:pgSz w:w="11907" w:h="16838"/>
       <w:pgMar w:top="0" w:right="0" w:bottom="0" w:left="0" w:header="0" w:footer="0" w:gutter="0"/>
       <w:cols w:space="720"/>
       <w:docGrid w:linePitch="360"/>
@@ -1054,12 +999,6 @@
     <w:name w:val="Normal"/>
     <w:qFormat/>
     <w:rsid w:val="00FC693F"/>
-    <w:pPr>
-      <w:spacing w:after="0" w:before="0"/>
-    </w:pPr>
-    <w:rPr>
-      <w:sz w:val="2"/>
-    </w:rPr>
   </w:style>
   <w:style w:type="paragraph" w:styleId="Header">
     <w:name w:val="header"/>

</xml_diff>